<commit_message>
update stage 1 and 2 docs
</commit_message>
<xml_diff>
--- a/stage_1/hb_stage_1.docx
+++ b/stage_1/hb_stage_1.docx
@@ -251,7 +251,7 @@
                 <w:szCs w:val="24"/>
                 <w:rtl w:val="0"/>
               </w:rPr>
-              <w:t xml:space="preserve">1</w:t>
+              <w:t xml:space="preserve">1.2</w:t>
             </w:r>
           </w:p>
         </w:tc>
@@ -1009,7 +1009,7 @@
           <w:szCs w:val="24"/>
           <w:rtl w:val="0"/>
         </w:rPr>
-        <w:t xml:space="preserve">QR/Code Reservation Manager for residencies/businesses: Services to generate access codes for reservations and security access. Works via numbercodes or QR Codes.</w:t>
+        <w:t xml:space="preserve">QR/Code Reservation Manager for residencies/businesses: Services to generate access codes for reservations and security access. Works via number codes or QR Codes.</w:t>
       </w:r>
     </w:p>
     <w:p>
@@ -3168,7 +3168,7 @@
           <w:szCs w:val="24"/>
           <w:rtl w:val="0"/>
         </w:rPr>
-        <w:t xml:space="preserve">Reservations Manager: The QR codes add an interesting concept but developing a mobile app would slow down development time. By removing the QR codes and changing focus on the administration functionality we could get a better MVP sooner and add QR scanning later.</w:t>
+        <w:t xml:space="preserve">Reservations Manager: The QR codes add an interesting concept but developing a mobile app would slow down development time. By removing the QR codes and changing focus on the administration functionality we could get a better MVP sooner.</w:t>
       </w:r>
     </w:p>
     <w:p>
@@ -3286,7 +3286,7 @@
           <w:szCs w:val="24"/>
           <w:rtl w:val="0"/>
         </w:rPr>
-        <w:t xml:space="preserve">We decided to choose the Reservation Manager to strike a balance between something simple that still serves a specific function and does not require a special infrastructure. We will focus on making the software an administrator only tool by removing the  QR functionality and client aspect. This approach allows us to allocate time on developing the core MVP. The final core of the project will be formed by a backend API and a web application frontend, we can implement QR scanning once the  project grows.</w:t>
+        <w:t xml:space="preserve">We decided to choose the Reservation Manager to strike a balance between something simple that still serves a specific function and without requiring special infrastructure. We will focus on making the software an administrator only tool by removing the QR feature and client aspect, meaning the app will be marketed towards businesses and restaurants instead of the general public. This approach allows us to allocate time on developing the core MVP. The final core of the project will be formed by a backend API and a web application frontend.</w:t>
       </w:r>
     </w:p>
     <w:p>
@@ -3547,7 +3547,7 @@
           <w:szCs w:val="24"/>
           <w:rtl w:val="0"/>
         </w:rPr>
-        <w:t xml:space="preserve">See pending, ongoing and finished reservations.</w:t>
+        <w:t xml:space="preserve">See pending, ongoing closed and cancelled reservations.</w:t>
       </w:r>
     </w:p>
     <w:p>
@@ -3734,7 +3734,33 @@
           <w:szCs w:val="24"/>
           <w:rtl w:val="0"/>
         </w:rPr>
-        <w:t xml:space="preserve">Assign “employee “ users to manage reservations without giving full permissions.</w:t>
+        <w:t xml:space="preserve">Assign “employee“ users to manage reservations without giving full permissions.</w:t>
+      </w:r>
+    </w:p>
+    <w:p>
+      <w:pPr>
+        <w:numPr>
+          <w:ilvl w:val="0"/>
+          <w:numId w:val="8"/>
+        </w:numPr>
+        <w:spacing w:line="240" w:lineRule="auto"/>
+        <w:ind w:left="720" w:hanging="360"/>
+        <w:jc w:val="both"/>
+        <w:rPr>
+          <w:rFonts w:ascii="Times New Roman" w:cs="Times New Roman" w:eastAsia="Times New Roman" w:hAnsi="Times New Roman"/>
+          <w:sz w:val="24"/>
+          <w:szCs w:val="24"/>
+          <w:u w:val="none"/>
+        </w:rPr>
+      </w:pPr>
+      <w:r>
+        <w:rPr>
+          <w:rFonts w:ascii="Times New Roman" w:cs="Times New Roman" w:eastAsia="Times New Roman" w:hAnsi="Times New Roman"/>
+          <w:sz w:val="24"/>
+          <w:szCs w:val="24"/>
+          <w:rtl w:val="0"/>
+        </w:rPr>
+        <w:t xml:space="preserve">Admin Panel.</w:t>
       </w:r>
     </w:p>
     <w:sectPr>

</xml_diff>